<commit_message>
Upload Week 2 project tracking report
Upload Week 2 document including paper summary, introduction, scope, and existing system analysis for the project.
</commit_message>
<xml_diff>
--- a/Paper/Week2_DE190963.docx
+++ b/Paper/Week2_DE190963.docx
@@ -128,8 +128,16 @@
               <w:rPr>
                 <w:b/>
               </w:rPr>
-              <w:t>Định hướng</w:t>
-            </w:r>
+              <w:t xml:space="preserve">Định </w:t>
+            </w:r>
+            <w:proofErr w:type="spellStart"/>
+            <w:r>
+              <w:rPr>
+                <w:b/>
+              </w:rPr>
+              <w:t>hướng</w:t>
+            </w:r>
+            <w:proofErr w:type="spellEnd"/>
           </w:p>
         </w:tc>
         <w:tc>
@@ -147,8 +155,165 @@
             <w:pPr>
               <w:jc w:val="both"/>
             </w:pPr>
-            <w:r>
-              <w:t>Ứng dụng Web hỗ trợ đặt thuê xe điện, quản lý đội xe, hạ tầng trạm sạc, thanh toán và đặt cọc trực tuyến.</w:t>
+            <w:proofErr w:type="spellStart"/>
+            <w:r>
+              <w:t>Ứng</w:t>
+            </w:r>
+            <w:proofErr w:type="spellEnd"/>
+            <w:r>
+              <w:t xml:space="preserve"> </w:t>
+            </w:r>
+            <w:proofErr w:type="spellStart"/>
+            <w:r>
+              <w:t>dụng</w:t>
+            </w:r>
+            <w:proofErr w:type="spellEnd"/>
+            <w:r>
+              <w:t xml:space="preserve"> Web </w:t>
+            </w:r>
+            <w:proofErr w:type="spellStart"/>
+            <w:r>
+              <w:t>hỗ</w:t>
+            </w:r>
+            <w:proofErr w:type="spellEnd"/>
+            <w:r>
+              <w:t xml:space="preserve"> </w:t>
+            </w:r>
+            <w:proofErr w:type="spellStart"/>
+            <w:r>
+              <w:t>trợ</w:t>
+            </w:r>
+            <w:proofErr w:type="spellEnd"/>
+            <w:r>
+              <w:t xml:space="preserve"> </w:t>
+            </w:r>
+            <w:proofErr w:type="spellStart"/>
+            <w:r>
+              <w:t>đặt</w:t>
+            </w:r>
+            <w:proofErr w:type="spellEnd"/>
+            <w:r>
+              <w:t xml:space="preserve"> </w:t>
+            </w:r>
+            <w:proofErr w:type="spellStart"/>
+            <w:r>
+              <w:t>thuê</w:t>
+            </w:r>
+            <w:proofErr w:type="spellEnd"/>
+            <w:r>
+              <w:t xml:space="preserve"> ô </w:t>
+            </w:r>
+            <w:proofErr w:type="spellStart"/>
+            <w:r>
+              <w:t>tô</w:t>
+            </w:r>
+            <w:proofErr w:type="spellEnd"/>
+            <w:r>
+              <w:t xml:space="preserve"> </w:t>
+            </w:r>
+            <w:proofErr w:type="spellStart"/>
+            <w:r>
+              <w:t>tự</w:t>
+            </w:r>
+            <w:proofErr w:type="spellEnd"/>
+            <w:r>
+              <w:t xml:space="preserve"> </w:t>
+            </w:r>
+            <w:proofErr w:type="spellStart"/>
+            <w:r>
+              <w:t>lái</w:t>
+            </w:r>
+            <w:proofErr w:type="spellEnd"/>
+            <w:r>
+              <w:t xml:space="preserve">, </w:t>
+            </w:r>
+            <w:proofErr w:type="spellStart"/>
+            <w:r>
+              <w:t>quản</w:t>
+            </w:r>
+            <w:proofErr w:type="spellEnd"/>
+            <w:r>
+              <w:t xml:space="preserve"> </w:t>
+            </w:r>
+            <w:proofErr w:type="spellStart"/>
+            <w:r>
+              <w:t>lý</w:t>
+            </w:r>
+            <w:proofErr w:type="spellEnd"/>
+            <w:r>
+              <w:t xml:space="preserve"> </w:t>
+            </w:r>
+            <w:proofErr w:type="spellStart"/>
+            <w:r>
+              <w:t>đội</w:t>
+            </w:r>
+            <w:proofErr w:type="spellEnd"/>
+            <w:r>
+              <w:t xml:space="preserve"> </w:t>
+            </w:r>
+            <w:proofErr w:type="spellStart"/>
+            <w:r>
+              <w:t>xe</w:t>
+            </w:r>
+            <w:proofErr w:type="spellEnd"/>
+            <w:r>
+              <w:t xml:space="preserve">, </w:t>
+            </w:r>
+            <w:proofErr w:type="spellStart"/>
+            <w:r>
+              <w:t>thanh</w:t>
+            </w:r>
+            <w:proofErr w:type="spellEnd"/>
+            <w:r>
+              <w:t xml:space="preserve"> </w:t>
+            </w:r>
+            <w:proofErr w:type="spellStart"/>
+            <w:r>
+              <w:t>toán</w:t>
+            </w:r>
+            <w:proofErr w:type="spellEnd"/>
+            <w:r>
+              <w:t xml:space="preserve"> </w:t>
+            </w:r>
+            <w:proofErr w:type="spellStart"/>
+            <w:r>
+              <w:t>và</w:t>
+            </w:r>
+            <w:proofErr w:type="spellEnd"/>
+            <w:r>
+              <w:t xml:space="preserve"> </w:t>
+            </w:r>
+            <w:proofErr w:type="spellStart"/>
+            <w:r>
+              <w:t>đặt</w:t>
+            </w:r>
+            <w:proofErr w:type="spellEnd"/>
+            <w:r>
+              <w:t xml:space="preserve"> </w:t>
+            </w:r>
+            <w:proofErr w:type="spellStart"/>
+            <w:r>
+              <w:t>cọc</w:t>
+            </w:r>
+            <w:proofErr w:type="spellEnd"/>
+            <w:r>
+              <w:t xml:space="preserve"> </w:t>
+            </w:r>
+            <w:proofErr w:type="spellStart"/>
+            <w:r>
+              <w:t>trực</w:t>
+            </w:r>
+            <w:proofErr w:type="spellEnd"/>
+            <w:r>
+              <w:t xml:space="preserve"> </w:t>
+            </w:r>
+            <w:proofErr w:type="spellStart"/>
+            <w:r>
+              <w:t>tuyến</w:t>
+            </w:r>
+            <w:proofErr w:type="spellEnd"/>
+            <w:r>
+              <w:t>.</w:t>
             </w:r>
           </w:p>
         </w:tc>
@@ -5037,7 +5202,6 @@
   <w:style w:type="character" w:default="1" w:styleId="DefaultParagraphFont">
     <w:name w:val="Default Paragraph Font"/>
     <w:uiPriority w:val="1"/>
-    <w:semiHidden/>
     <w:unhideWhenUsed/>
   </w:style>
   <w:style w:type="table" w:default="1" w:styleId="TableNormal">

</xml_diff>